<commit_message>
Kopiowanie Oryginalnych danych RCP: wspolna metoda kopiujaca w dodatkowym kodzie A1KopiowanieRCP (projekt Business) zamiast duplikatu w obu zadaniach; dokumentacja: harmonogram co 15 minut, konfiguracja dodatkowego kodu
Co-Authored-By: Claude Opus 5.5 <noreply@anthropic.com>
Claude-Session: https://claude.ai/code/session_016Sk1XN31K2XRRWhL9D8Qkd
</commit_message>
<xml_diff>
--- a/Taski/Instrukcja_Kopiowanie_RCP.docx
+++ b/Taski/Instrukcja_Kopiowanie_RCP.docx
@@ -579,6 +579,25 @@
           <w:sz w:val="22"/>
           <w:szCs w:val="22"/>
         </w:rPr>
+        <w:t xml:space="preserve">Ustawienia/Systemowe/Dodatkowy kod do kompilacji – „A1KopiowanieRCP” (projekt Business, kod z pliku Taski/A1KopiowanieRCP): wspólna metoda kopiująca jeden zapis, używana przez oba zadania.</w:t>
+      </w:r>
+    </w:p>
+    <w:p>
+      <w:pPr>
+        <w:spacing w:line="276" w:lineRule="auto"/>
+        <w:jc w:val="both"/>
+        <w:rPr>
+          <w:rFonts w:ascii="Calibri" w:hAnsi="Calibri" w:cs="Calibri"/>
+          <w:sz w:val="22"/>
+          <w:szCs w:val="22"/>
+        </w:rPr>
+      </w:pPr>
+      <w:r>
+        <w:rPr>
+          <w:rFonts w:ascii="Calibri" w:hAnsi="Calibri" w:cs="Calibri"/>
+          <w:sz w:val="22"/>
+          <w:szCs w:val="22"/>
+        </w:rPr>
         <w:t xml:space="preserve">Zadanie nie tworzy rekordów zadań – cała praca jest wykonywana w warunku generowania, który zawsze zwraca „nie”. Po zmianie kodu: czynność „Wymuś rekompilację” na definicji zadania.</w:t>
       </w:r>
     </w:p>
@@ -1184,7 +1203,7 @@
           <w:sz w:val="22"/>
           <w:szCs w:val="22"/>
         </w:rPr>
-        <w:t xml:space="preserve">Kopiowanie działa tak samo jak przy zapisie (te same pola i te same zabezpieczenia przed duplikatami), więc oba zadania mogą pracować równolegle. Zapisy starsze niż 31 dni nie są przeglądane – okres zmienia stała DniWsteczHarmonogramu w kodzie zadania.</w:t>
+        <w:t xml:space="preserve">Kopiowanie działa tak samo jak przy zapisie (ta sama metoda z dodatkowego kodu A1KopiowanieRCP – te same pola i te same zabezpieczenia przed duplikatami), więc oba zadania mogą pracować równolegle. Zapisy starsze niż 31 dni nie są przeglądane – okres zmienia stała DniWsteczHarmonogramu w kodzie zadania.</w:t>
       </w:r>
     </w:p>
     <w:p/>
@@ -1342,6 +1361,25 @@
           <w:sz w:val="22"/>
           <w:szCs w:val="22"/>
         </w:rPr>
+        <w:t xml:space="preserve">- kopiowanie zapisu – wspólny dodatkowy kod „A1KopiowanieRCP” (jak w rozdziale 1)</w:t>
+      </w:r>
+    </w:p>
+    <w:p>
+      <w:pPr>
+        <w:spacing w:line="276" w:lineRule="auto"/>
+        <w:jc w:val="both"/>
+        <w:rPr>
+          <w:rFonts w:ascii="Calibri" w:hAnsi="Calibri" w:cs="Calibri"/>
+          <w:sz w:val="22"/>
+          <w:szCs w:val="22"/>
+        </w:rPr>
+      </w:pPr>
+      <w:r>
+        <w:rPr>
+          <w:rFonts w:ascii="Calibri" w:hAnsi="Calibri" w:cs="Calibri"/>
+          <w:sz w:val="22"/>
+          <w:szCs w:val="22"/>
+        </w:rPr>
         <w:t xml:space="preserve">Ustawienia/Workflow/Harmonogram zadań/Zadania globalne – zadanie o definicji „Kopiuj oryginalne dane RCP harmonogram” (źródło zadania: root), na jego zakładce Automatyczne akcje harmonogram „Kopiuj oryginalne dane RCP co 15 min”:</w:t>
       </w:r>
     </w:p>
@@ -1380,7 +1418,7 @@
           <w:sz w:val="22"/>
           <w:szCs w:val="22"/>
         </w:rPr>
-        <w:t xml:space="preserve">- Definicja cyklu: co 15 minut, rozpoczęcie cyklu 20.10.2026 (na czas testów w bazie Al: co minutę)</w:t>
+        <w:t xml:space="preserve">- Definicja cyklu: co 15 minut, rozpoczęcie cyklu 20.10.2026</w:t>
       </w:r>
     </w:p>
     <w:p>

</xml_diff>